<commit_message>
Add competitive analysis section to strategy document
https://claude.ai/code/session_017RWre91nSDnsuxrwkvT696
</commit_message>
<xml_diff>
--- a/Strategie_macreationdesociete.docx
+++ b/Strategie_macreationdesociete.docx
@@ -2654,6 +2654,519 @@
         <w:t>Document de travail — chiffres = ordres de grandeur. À ajuster selon les vrais ratios mesurés dès J1.</w:t>
       </w:r>
     </w:p>
+    <w:p>
+      <w:r>
+        <w:br w:type="page"/>
+      </w:r>
+    </w:p>
+    <w:p>
+      <w:pPr>
+        <w:pStyle w:val="Heading1"/>
+      </w:pPr>
+      <w:r>
+        <w:rPr>
+          <w:b/>
+          <w:color w:val="1F3A5F"/>
+          <w:sz w:val="32"/>
+        </w:rPr>
+        <w:t>8. Analyse concurrentielle &amp; ta zone blanche</w:t>
+      </w:r>
+    </w:p>
+    <w:p>
+      <w:r>
+        <w:rPr>
+          <w:b w:val="0"/>
+          <w:i/>
+          <w:color w:val="555555"/>
+          <w:sz w:val="22"/>
+        </w:rPr>
+        <w:t>La stratégie « création gratuite comme produit d'appel » est déjà le modèle dominant du marché — prouvée et gagnante, mais portée par des acteurs aux poches profondes. Voici qui l'a fait, comment, combien ça a coûté, et où se trouve TA fenêtre rentable.</w:t>
+      </w:r>
+    </w:p>
+    <w:p>
+      <w:pPr>
+        <w:pStyle w:val="Heading2"/>
+      </w:pPr>
+      <w:r>
+        <w:rPr>
+          <w:b/>
+          <w:color w:val="2E6DA4"/>
+          <w:sz w:val="26"/>
+        </w:rPr>
+        <w:t>Qui l'a fait</w:t>
+      </w:r>
+    </w:p>
+    <w:p>
+      <w:pPr>
+        <w:pStyle w:val="ListBullet"/>
+      </w:pPr>
+      <w:r>
+        <w:rPr>
+          <w:b/>
+        </w:rPr>
+        <w:t xml:space="preserve">Les néobanques pro </w:t>
+      </w:r>
+      <w:r>
+        <w:t>(Qonto, Shine, Propulse by CA, Blank, Indy) : création de société 100 % gratuite. Qonto fournit même des statuts gratuits rédigés par des avocats, en Word, sans inscription. Contrepartie : ouvrir un compte pro chez eux. C'est EXACTEMENT ton modèle, sauf qu'eux encaissent l'abonnement en direct.</w:t>
+      </w:r>
+    </w:p>
+    <w:p>
+      <w:pPr>
+        <w:pStyle w:val="ListBullet"/>
+      </w:pPr>
+      <w:r>
+        <w:rPr>
+          <w:b/>
+        </w:rPr>
+        <w:t xml:space="preserve">Les legaltech </w:t>
+      </w:r>
+      <w:r>
+        <w:t>(Legalstart, LegalPlace, Captain Contrat) : création low-cost en produit d'appel, monétisée par les services récurrents (compta, domiciliation, juridique).</w:t>
+      </w:r>
+    </w:p>
+    <w:p>
+      <w:pPr>
+        <w:pStyle w:val="Heading2"/>
+      </w:pPr>
+      <w:r>
+        <w:rPr>
+          <w:b/>
+          <w:color w:val="2E6DA4"/>
+          <w:sz w:val="26"/>
+        </w:rPr>
+        <w:t>Comment ils l'ont promu</w:t>
+      </w:r>
+    </w:p>
+    <w:p>
+      <w:pPr>
+        <w:pStyle w:val="ListBullet"/>
+      </w:pPr>
+      <w:r>
+        <w:t>Google Ads massif sur « créer sa SASU » (c'est eux qui font monter le CPC à &gt;15 €).</w:t>
+      </w:r>
+    </w:p>
+    <w:p>
+      <w:pPr>
+        <w:pStyle w:val="ListBullet"/>
+      </w:pPr>
+      <w:r>
+        <w:t>SEO industriel : des milliers de pages guides.</w:t>
+      </w:r>
+    </w:p>
+    <w:p>
+      <w:pPr>
+        <w:pStyle w:val="ListBullet"/>
+      </w:pPr>
+      <w:r>
+        <w:t>Notoriété payante lourde : TV, métro, affichage, sponsoring (Qonto).</w:t>
+      </w:r>
+    </w:p>
+    <w:p>
+      <w:pPr>
+        <w:pStyle w:val="ListBullet"/>
+      </w:pPr>
+      <w:r>
+        <w:t>Parrainage propre avec prime (refer-a-friend) — la version LÉGALE du « recommande 5 amis ». Aucun acteur sérieux ne conditionne le service à « mets 5 étoiles ».</w:t>
+      </w:r>
+    </w:p>
+    <w:p>
+      <w:pPr>
+        <w:pStyle w:val="Heading2"/>
+      </w:pPr>
+      <w:r>
+        <w:rPr>
+          <w:b/>
+          <w:color w:val="2E6DA4"/>
+          <w:sz w:val="26"/>
+        </w:rPr>
+        <w:t>Combien ça a coûté (estimations — chiffres réels confidentiels)</w:t>
+      </w:r>
+    </w:p>
+    <w:tbl>
+      <w:tblPr>
+        <w:tblStyle w:val="LightGrid-Accent1"/>
+        <w:tblW w:type="auto" w:w="0"/>
+        <w:jc w:val="center"/>
+        <w:tblLook w:firstColumn="1" w:firstRow="1" w:lastColumn="0" w:lastRow="0" w:noHBand="0" w:noVBand="1" w:val="04A0"/>
+      </w:tblPr>
+      <w:tblGrid>
+        <w:gridCol w:w="2880"/>
+        <w:gridCol w:w="2880"/>
+        <w:gridCol w:w="2880"/>
+      </w:tblGrid>
+      <w:tr>
+        <w:tc>
+          <w:tcPr>
+            <w:tcW w:type="dxa" w:w="2592"/>
+            <w:shd w:val="clear" w:fill="2E6DA4"/>
+          </w:tcPr>
+          <w:p>
+            <w:r/>
+            <w:r>
+              <w:rPr>
+                <w:b/>
+                <w:color w:val="FFFFFF"/>
+                <w:sz w:val="20"/>
+              </w:rPr>
+              <w:t>Acteur</w:t>
+            </w:r>
+          </w:p>
+        </w:tc>
+        <w:tc>
+          <w:tcPr>
+            <w:tcW w:type="dxa" w:w="2592"/>
+            <w:shd w:val="clear" w:fill="2E6DA4"/>
+          </w:tcPr>
+          <w:p>
+            <w:r/>
+            <w:r>
+              <w:rPr>
+                <w:b/>
+                <w:color w:val="FFFFFF"/>
+                <w:sz w:val="20"/>
+              </w:rPr>
+              <w:t>CAC estimé</w:t>
+            </w:r>
+          </w:p>
+        </w:tc>
+        <w:tc>
+          <w:tcPr>
+            <w:tcW w:type="dxa" w:w="4320"/>
+            <w:shd w:val="clear" w:fill="2E6DA4"/>
+          </w:tcPr>
+          <w:p>
+            <w:r/>
+            <w:r>
+              <w:rPr>
+                <w:b/>
+                <w:color w:val="FFFFFF"/>
+                <w:sz w:val="20"/>
+              </w:rPr>
+              <w:t>Pourquoi c'est rentable</w:t>
+            </w:r>
+          </w:p>
+        </w:tc>
+      </w:tr>
+      <w:tr>
+        <w:tc>
+          <w:tcPr>
+            <w:tcW w:type="dxa" w:w="2592"/>
+          </w:tcPr>
+          <w:p>
+            <w:r/>
+            <w:r>
+              <w:rPr>
+                <w:sz w:val="20"/>
+              </w:rPr>
+              <w:t>Néobanque pro</w:t>
+            </w:r>
+          </w:p>
+        </w:tc>
+        <w:tc>
+          <w:tcPr>
+            <w:tcW w:type="dxa" w:w="2592"/>
+          </w:tcPr>
+          <w:p>
+            <w:r/>
+            <w:r>
+              <w:rPr>
+                <w:sz w:val="20"/>
+              </w:rPr>
+              <w:t>~100-300 € / compte</w:t>
+            </w:r>
+          </w:p>
+        </w:tc>
+        <w:tc>
+          <w:tcPr>
+            <w:tcW w:type="dxa" w:w="4320"/>
+          </w:tcPr>
+          <w:p>
+            <w:r/>
+            <w:r>
+              <w:rPr>
+                <w:sz w:val="20"/>
+              </w:rPr>
+              <w:t>Abonnement récurrent 9-30 €/mois</w:t>
+            </w:r>
+          </w:p>
+        </w:tc>
+      </w:tr>
+      <w:tr>
+        <w:tc>
+          <w:tcPr>
+            <w:tcW w:type="dxa" w:w="2592"/>
+          </w:tcPr>
+          <w:p>
+            <w:r/>
+            <w:r>
+              <w:rPr>
+                <w:sz w:val="20"/>
+              </w:rPr>
+              <w:t>Legaltech</w:t>
+            </w:r>
+          </w:p>
+        </w:tc>
+        <w:tc>
+          <w:tcPr>
+            <w:tcW w:type="dxa" w:w="2592"/>
+          </w:tcPr>
+          <w:p>
+            <w:r/>
+            <w:r>
+              <w:rPr>
+                <w:sz w:val="20"/>
+              </w:rPr>
+              <w:t>~50-150 € / lead</w:t>
+            </w:r>
+          </w:p>
+        </w:tc>
+        <w:tc>
+          <w:tcPr>
+            <w:tcW w:type="dxa" w:w="4320"/>
+          </w:tcPr>
+          <w:p>
+            <w:r/>
+            <w:r>
+              <w:rPr>
+                <w:sz w:val="20"/>
+              </w:rPr>
+              <w:t>Dossier vendu 200-500 €</w:t>
+            </w:r>
+          </w:p>
+        </w:tc>
+      </w:tr>
+    </w:tbl>
+    <w:p>
+      <w:r>
+        <w:rPr>
+          <w:b w:val="0"/>
+          <w:i w:val="0"/>
+          <w:color w:val="555555"/>
+          <w:sz w:val="20"/>
+        </w:rPr>
+        <w:t>Budgets globaux : énormes. Qonto a levé 486 M€ (valo 4,4 Md€). LegalPlace a levé 70 M€ (mai 2026) et racheté Legalstart.</w:t>
+      </w:r>
+    </w:p>
+    <w:p>
+      <w:pPr>
+        <w:pStyle w:val="Heading2"/>
+      </w:pPr>
+      <w:r>
+        <w:rPr>
+          <w:b/>
+          <w:color w:val="2E6DA4"/>
+          <w:sz w:val="26"/>
+        </w:rPr>
+        <w:t>Gagnant ou pas ? → Oui, massivement</w:t>
+      </w:r>
+    </w:p>
+    <w:p>
+      <w:pPr>
+        <w:pStyle w:val="ListBullet"/>
+      </w:pPr>
+      <w:r>
+        <w:t>LegalPlace + Legalstart = ~20 % de toutes les créations de sociétés en France, +60 %/an, objectif &gt;100 M€ de CA.</w:t>
+      </w:r>
+    </w:p>
+    <w:p>
+      <w:pPr>
+        <w:pStyle w:val="ListBullet"/>
+      </w:pPr>
+      <w:r>
+        <w:t>Qonto : 450 000 clients.</w:t>
+      </w:r>
+    </w:p>
+    <w:p>
+      <w:pPr>
+        <w:pStyle w:val="ListBullet"/>
+      </w:pPr>
+      <w:r>
+        <w:t>Shine : 150 000 clients, racheté par Cegid.</w:t>
+      </w:r>
+    </w:p>
+    <w:p>
+      <w:r>
+        <w:rPr>
+          <w:b/>
+          <w:i w:val="0"/>
+          <w:sz w:val="22"/>
+        </w:rPr>
+        <w:t>La stratégie est prouvée — MAIS à condition d'avoir des poches profondes ET une monétisation récurrente (abonnement) qui finance l'acquisition.</w:t>
+      </w:r>
+    </w:p>
+    <w:p>
+      <w:pPr>
+        <w:pStyle w:val="Heading2"/>
+      </w:pPr>
+      <w:r>
+        <w:rPr>
+          <w:b/>
+          <w:color w:val="2E6DA4"/>
+          <w:sz w:val="26"/>
+        </w:rPr>
+        <w:t>Ce que ça signifie POUR TOI</w:t>
+      </w:r>
+    </w:p>
+    <w:p>
+      <w:pPr>
+        <w:pStyle w:val="ListNumber"/>
+      </w:pPr>
+      <w:r>
+        <w:rPr>
+          <w:b/>
+        </w:rPr>
+        <w:t>Tu ne peux PAS gagner la guerre de la création</w:t>
+      </w:r>
+      <w:r>
+        <w:t xml:space="preserve"> face à ces géants : ils absorbent leur CAC via l'abonnement, toi tu n'as qu'une commission one-shot (LTV faible). → Organique-first, pas de bataille payante sur « créer une SASU ».</w:t>
+      </w:r>
+    </w:p>
+    <w:p>
+      <w:pPr>
+        <w:pStyle w:val="ListNumber"/>
+      </w:pPr>
+      <w:r>
+        <w:rPr>
+          <w:b/>
+          <w:color w:val="1E7A3C"/>
+        </w:rPr>
+        <w:t>Ta vraie zone blanche = les modifs et fermetures.</w:t>
+      </w:r>
+      <w:r>
+        <w:t xml:space="preserve"> Les néobanques s'en fichent : pas de compte pro à vendre derrière un transfert de siège ou une dissolution. Personne ne les sert bien. Ton angle « 850 € pour changer une adresse → gratuit » y est imbattable et peu concurrencé.</w:t>
+      </w:r>
+    </w:p>
+    <w:p>
+      <w:pPr>
+        <w:pStyle w:val="ListNumber"/>
+      </w:pPr>
+      <w:r>
+        <w:rPr>
+          <w:b/>
+        </w:rPr>
+        <w:t>Ta différence vs Qonto</w:t>
+      </w:r>
+      <w:r>
+        <w:t xml:space="preserve"> : aucune obligation d'ouvrir un compte (Qonto l'impose) + tout le cycle de vie de la société, pas juste la naissance.</w:t>
+      </w:r>
+    </w:p>
+    <w:p>
+      <w:r>
+        <w:rPr>
+          <w:b/>
+          <w:color w:val="1F3A5F"/>
+        </w:rPr>
+        <w:t>En clair : copie le modèle gagnant (gratuit + monétisation par apport d'affaires), mais change de terrain de jeu — vise les formalités que les géants ignorent, en organique. C'est ta seule fenêtre rentable.</w:t>
+      </w:r>
+    </w:p>
+    <w:p>
+      <w:pPr>
+        <w:pStyle w:val="Heading2"/>
+      </w:pPr>
+      <w:r>
+        <w:rPr>
+          <w:b/>
+          <w:color w:val="2E6DA4"/>
+          <w:sz w:val="26"/>
+        </w:rPr>
+        <w:t>Sources</w:t>
+      </w:r>
+    </w:p>
+    <w:p>
+      <w:pPr>
+        <w:pStyle w:val="ListBullet"/>
+      </w:pPr>
+      <w:r>
+        <w:rPr>
+          <w:sz w:val="18"/>
+        </w:rPr>
+        <w:t xml:space="preserve">Qonto — Création de société gratuite : </w:t>
+      </w:r>
+      <w:r>
+        <w:rPr>
+          <w:i/>
+          <w:color w:val="2E6DA4"/>
+          <w:sz w:val="18"/>
+        </w:rPr>
+        <w:t>https://qonto.com/fr/creation</w:t>
+      </w:r>
+    </w:p>
+    <w:p>
+      <w:pPr>
+        <w:pStyle w:val="ListBullet"/>
+      </w:pPr>
+      <w:r>
+        <w:rPr>
+          <w:sz w:val="18"/>
+        </w:rPr>
+        <w:t xml:space="preserve">Shine — Meilleurs sites pour créer son entreprise : </w:t>
+      </w:r>
+      <w:r>
+        <w:rPr>
+          <w:i/>
+          <w:color w:val="2E6DA4"/>
+          <w:sz w:val="18"/>
+        </w:rPr>
+        <w:t>https://www.shine.fr/blog/meilleurs-sites-creer-entreprise/</w:t>
+      </w:r>
+    </w:p>
+    <w:p>
+      <w:pPr>
+        <w:pStyle w:val="ListBullet"/>
+      </w:pPr>
+      <w:r>
+        <w:rPr>
+          <w:sz w:val="18"/>
+        </w:rPr>
+        <w:t xml:space="preserve">LegalPlace lève 70 M€ et rachète Legalstart — Maddyness : </w:t>
+      </w:r>
+      <w:r>
+        <w:rPr>
+          <w:i/>
+          <w:color w:val="2E6DA4"/>
+          <w:sz w:val="18"/>
+        </w:rPr>
+        <w:t>https://www.maddyness.com/2026/05/05/legalplace-leve-70-millions-deuros-et-sempare-de-legalstart/</w:t>
+      </w:r>
+    </w:p>
+    <w:p>
+      <w:pPr>
+        <w:pStyle w:val="ListBullet"/>
+      </w:pPr>
+      <w:r>
+        <w:rPr>
+          <w:sz w:val="18"/>
+        </w:rPr>
+        <w:t xml:space="preserve">LegalPlace/Legalstart : ~20 % des créations — Finyear : </w:t>
+      </w:r>
+      <w:r>
+        <w:rPr>
+          <w:i/>
+          <w:color w:val="2E6DA4"/>
+          <w:sz w:val="18"/>
+        </w:rPr>
+        <w:t>https://finyear.com/legalplace-leve-70-me-et-acquiert-legalstart-pour-operer-pres-de-20-des-creations-de-societes-en-france</w:t>
+      </w:r>
+    </w:p>
+    <w:p>
+      <w:pPr>
+        <w:pStyle w:val="ListBullet"/>
+      </w:pPr>
+      <w:r>
+        <w:rPr>
+          <w:sz w:val="18"/>
+        </w:rPr>
+        <w:t xml:space="preserve">Qonto — tarifs, avis, clients — FrenchWeb : </w:t>
+      </w:r>
+      <w:r>
+        <w:rPr>
+          <w:i/>
+          <w:color w:val="2E6DA4"/>
+          <w:sz w:val="18"/>
+        </w:rPr>
+        <w:t>https://www.frenchweb.fr/qonto</w:t>
+      </w:r>
+    </w:p>
     <w:sectPr>
       <w:pgSz w:w="12240" w:h="15840"/>
       <w:pgMar w:top="1440" w:right="1800" w:bottom="1440" w:left="1800" w:header="720" w:footer="720" w:gutter="0"/>

</xml_diff>